<commit_message>
Ve lai so do ban kinh nguyen tu 3D (Y, R, X, T) do net cao vector PDF, PNG 300/600 DPI, Transparent va SVG
</commit_message>
<xml_diff>
--- a/San_Pham/De_Kiem_Tra_GK1_Hoa_10_BacNinh_2025_HocSinh.docx
+++ b/San_Pham/De_Kiem_Tra_GK1_Hoa_10_BacNinh_2025_HocSinh.docx
@@ -2881,7 +2881,7 @@
       <w:r>
         <w:drawing>
           <wp:inline xmlns:a="http://schemas.openxmlformats.org/drawingml/2006/main" xmlns:pic="http://schemas.openxmlformats.org/drawingml/2006/picture">
-            <wp:extent cx="3600000" cy="972973"/>
+            <wp:extent cx="3600000" cy="1328296"/>
             <wp:docPr id="3" name="Picture 3"/>
             <wp:cNvGraphicFramePr>
               <a:graphicFrameLocks noChangeAspect="1"/>
@@ -2902,7 +2902,7 @@
                   <pic:spPr>
                     <a:xfrm>
                       <a:off x="0" y="0"/>
-                      <a:ext cx="3600000" cy="972973"/>
+                      <a:ext cx="3600000" cy="1328296"/>
                     </a:xfrm>
                     <a:prstGeom prst="rect"/>
                   </pic:spPr>

</xml_diff>